<commit_message>
Actualizando el archivo de examen para incluir un número mayor de preguntas y aleatorizando los modelos en la tabla de resultados. '2023-Matematicas-11-2-04-Op-C.Rmd'. Baterías
</commit_message>
<xml_diff>
--- a/Lab/Mediana/salida/2023-Matematicas-11-2-04-Op-C_1.docx
+++ b/Lab/Mediana/salida/2023-Matematicas-11-2-04-Op-C_1.docx
@@ -137,7 +137,7 @@
         <w:br/>
       </w:r>
       <w:r>
-        <w:t xml:space="preserve">La empresa MobilPro realizó pruebas de uso intensivo en tres modelos de teléfonos celulares. La siguiente tabla muestra la duración de la batería (en minutos) para cada modelo durante cinco pruebas diferentes:</w:t>
+        <w:t xml:space="preserve">La empresa TechLife realizó pruebas de rendimiento en tres modelos de teléfonos celulares. La siguiente tabla muestra la duración de la batería (en minutos) para cada modelo durante cinco pruebas diferentes:</w:t>
       </w:r>
     </w:p>
     <w:tbl>
@@ -174,31 +174,31 @@
               <w:jc w:val="right"/>
             </w:pPr>
             <w:r>
-              <w:t xml:space="preserve">Modelo V</w:t>
-            </w:r>
-          </w:p>
-        </w:tc>
-        <w:tc>
-          <w:tcPr/>
-          <w:p>
-            <w:pPr>
-              <w:pStyle w:val="Compact"/>
-              <w:jc w:val="right"/>
-            </w:pPr>
-            <w:r>
-              <w:t xml:space="preserve">Modelo W</w:t>
-            </w:r>
-          </w:p>
-        </w:tc>
-        <w:tc>
-          <w:tcPr/>
-          <w:p>
-            <w:pPr>
-              <w:pStyle w:val="Compact"/>
-              <w:jc w:val="right"/>
-            </w:pPr>
-            <w:r>
-              <w:t xml:space="preserve">Modelo M</w:t>
+              <w:t xml:space="preserve">Modelo U</w:t>
+            </w:r>
+          </w:p>
+        </w:tc>
+        <w:tc>
+          <w:tcPr/>
+          <w:p>
+            <w:pPr>
+              <w:pStyle w:val="Compact"/>
+              <w:jc w:val="right"/>
+            </w:pPr>
+            <w:r>
+              <w:t xml:space="preserve">Modelo A</w:t>
+            </w:r>
+          </w:p>
+        </w:tc>
+        <w:tc>
+          <w:tcPr/>
+          <w:p>
+            <w:pPr>
+              <w:pStyle w:val="Compact"/>
+              <w:jc w:val="right"/>
+            </w:pPr>
+            <w:r>
+              <w:t xml:space="preserve">Modelo C</w:t>
             </w:r>
           </w:p>
         </w:tc>
@@ -224,31 +224,31 @@
               <w:jc w:val="right"/>
             </w:pPr>
             <w:r>
-              <w:t xml:space="preserve">690</w:t>
-            </w:r>
-          </w:p>
-        </w:tc>
-        <w:tc>
-          <w:tcPr/>
-          <w:p>
-            <w:pPr>
-              <w:pStyle w:val="Compact"/>
-              <w:jc w:val="right"/>
-            </w:pPr>
-            <w:r>
-              <w:t xml:space="preserve">797</w:t>
-            </w:r>
-          </w:p>
-        </w:tc>
-        <w:tc>
-          <w:tcPr/>
-          <w:p>
-            <w:pPr>
-              <w:pStyle w:val="Compact"/>
-              <w:jc w:val="right"/>
-            </w:pPr>
-            <w:r>
-              <w:t xml:space="preserve">700</w:t>
+              <w:t xml:space="preserve">726</w:t>
+            </w:r>
+          </w:p>
+        </w:tc>
+        <w:tc>
+          <w:tcPr/>
+          <w:p>
+            <w:pPr>
+              <w:pStyle w:val="Compact"/>
+              <w:jc w:val="right"/>
+            </w:pPr>
+            <w:r>
+              <w:t xml:space="preserve">738</w:t>
+            </w:r>
+          </w:p>
+        </w:tc>
+        <w:tc>
+          <w:tcPr/>
+          <w:p>
+            <w:pPr>
+              <w:pStyle w:val="Compact"/>
+              <w:jc w:val="right"/>
+            </w:pPr>
+            <w:r>
+              <w:t xml:space="preserve">870</w:t>
             </w:r>
           </w:p>
         </w:tc>
@@ -274,31 +274,31 @@
               <w:jc w:val="right"/>
             </w:pPr>
             <w:r>
-              <w:t xml:space="preserve">729</w:t>
-            </w:r>
-          </w:p>
-        </w:tc>
-        <w:tc>
-          <w:tcPr/>
-          <w:p>
-            <w:pPr>
-              <w:pStyle w:val="Compact"/>
-              <w:jc w:val="right"/>
-            </w:pPr>
-            <w:r>
-              <w:t xml:space="preserve">538</w:t>
-            </w:r>
-          </w:p>
-        </w:tc>
-        <w:tc>
-          <w:tcPr/>
-          <w:p>
-            <w:pPr>
-              <w:pStyle w:val="Compact"/>
-              <w:jc w:val="right"/>
-            </w:pPr>
-            <w:r>
-              <w:t xml:space="preserve">733</w:t>
+              <w:t xml:space="preserve">760</w:t>
+            </w:r>
+          </w:p>
+        </w:tc>
+        <w:tc>
+          <w:tcPr/>
+          <w:p>
+            <w:pPr>
+              <w:pStyle w:val="Compact"/>
+              <w:jc w:val="right"/>
+            </w:pPr>
+            <w:r>
+              <w:t xml:space="preserve">787</w:t>
+            </w:r>
+          </w:p>
+        </w:tc>
+        <w:tc>
+          <w:tcPr/>
+          <w:p>
+            <w:pPr>
+              <w:pStyle w:val="Compact"/>
+              <w:jc w:val="right"/>
+            </w:pPr>
+            <w:r>
+              <w:t xml:space="preserve">764</w:t>
             </w:r>
           </w:p>
         </w:tc>
@@ -324,31 +324,31 @@
               <w:jc w:val="right"/>
             </w:pPr>
             <w:r>
-              <w:t xml:space="preserve">774</w:t>
-            </w:r>
-          </w:p>
-        </w:tc>
-        <w:tc>
-          <w:tcPr/>
-          <w:p>
-            <w:pPr>
-              <w:pStyle w:val="Compact"/>
-              <w:jc w:val="right"/>
-            </w:pPr>
-            <w:r>
-              <w:t xml:space="preserve">804</w:t>
-            </w:r>
-          </w:p>
-        </w:tc>
-        <w:tc>
-          <w:tcPr/>
-          <w:p>
-            <w:pPr>
-              <w:pStyle w:val="Compact"/>
-              <w:jc w:val="right"/>
-            </w:pPr>
-            <w:r>
-              <w:t xml:space="preserve">795</w:t>
+              <w:t xml:space="preserve">756</w:t>
+            </w:r>
+          </w:p>
+        </w:tc>
+        <w:tc>
+          <w:tcPr/>
+          <w:p>
+            <w:pPr>
+              <w:pStyle w:val="Compact"/>
+              <w:jc w:val="right"/>
+            </w:pPr>
+            <w:r>
+              <w:t xml:space="preserve">760</w:t>
+            </w:r>
+          </w:p>
+        </w:tc>
+        <w:tc>
+          <w:tcPr/>
+          <w:p>
+            <w:pPr>
+              <w:pStyle w:val="Compact"/>
+              <w:jc w:val="right"/>
+            </w:pPr>
+            <w:r>
+              <w:t xml:space="preserve">791</w:t>
             </w:r>
           </w:p>
         </w:tc>
@@ -374,31 +374,31 @@
               <w:jc w:val="right"/>
             </w:pPr>
             <w:r>
-              <w:t xml:space="preserve">790</w:t>
-            </w:r>
-          </w:p>
-        </w:tc>
-        <w:tc>
-          <w:tcPr/>
-          <w:p>
-            <w:pPr>
-              <w:pStyle w:val="Compact"/>
-              <w:jc w:val="right"/>
-            </w:pPr>
-            <w:r>
-              <w:t xml:space="preserve">778</w:t>
-            </w:r>
-          </w:p>
-        </w:tc>
-        <w:tc>
-          <w:tcPr/>
-          <w:p>
-            <w:pPr>
-              <w:pStyle w:val="Compact"/>
-              <w:jc w:val="right"/>
-            </w:pPr>
-            <w:r>
-              <w:t xml:space="preserve">774</w:t>
+              <w:t xml:space="preserve">781</w:t>
+            </w:r>
+          </w:p>
+        </w:tc>
+        <w:tc>
+          <w:tcPr/>
+          <w:p>
+            <w:pPr>
+              <w:pStyle w:val="Compact"/>
+              <w:jc w:val="right"/>
+            </w:pPr>
+            <w:r>
+              <w:t xml:space="preserve">785</w:t>
+            </w:r>
+          </w:p>
+        </w:tc>
+        <w:tc>
+          <w:tcPr/>
+          <w:p>
+            <w:pPr>
+              <w:pStyle w:val="Compact"/>
+              <w:jc w:val="right"/>
+            </w:pPr>
+            <w:r>
+              <w:t xml:space="preserve">649</w:t>
             </w:r>
           </w:p>
         </w:tc>
@@ -424,31 +424,31 @@
               <w:jc w:val="right"/>
             </w:pPr>
             <w:r>
-              <w:t xml:space="preserve">809</w:t>
-            </w:r>
-          </w:p>
-        </w:tc>
-        <w:tc>
-          <w:tcPr/>
-          <w:p>
-            <w:pPr>
-              <w:pStyle w:val="Compact"/>
-              <w:jc w:val="right"/>
-            </w:pPr>
-            <w:r>
-              <w:t xml:space="preserve">585</w:t>
-            </w:r>
-          </w:p>
-        </w:tc>
-        <w:tc>
-          <w:tcPr/>
-          <w:p>
-            <w:pPr>
-              <w:pStyle w:val="Compact"/>
-              <w:jc w:val="right"/>
-            </w:pPr>
-            <w:r>
-              <w:t xml:space="preserve">779</w:t>
+              <w:t xml:space="preserve">792</w:t>
+            </w:r>
+          </w:p>
+        </w:tc>
+        <w:tc>
+          <w:tcPr/>
+          <w:p>
+            <w:pPr>
+              <w:pStyle w:val="Compact"/>
+              <w:jc w:val="right"/>
+            </w:pPr>
+            <w:r>
+              <w:t xml:space="preserve">746</w:t>
+            </w:r>
+          </w:p>
+        </w:tc>
+        <w:tc>
+          <w:tcPr/>
+          <w:p>
+            <w:pPr>
+              <w:pStyle w:val="Compact"/>
+              <w:jc w:val="right"/>
+            </w:pPr>
+            <w:r>
+              <w:t xml:space="preserve">674</w:t>
             </w:r>
           </w:p>
         </w:tc>
@@ -473,7 +473,7 @@
         </w:numPr>
       </w:pPr>
       <w:r>
-        <w:t xml:space="preserve">El Modelo V tiene una mediana igual a la del Modelo W y menor que la del Modelo M.</w:t>
+        <w:t xml:space="preserve">El Modelo U tiene una mediana igual a la del Modelo C y menor que la del Modelo A.</w:t>
       </w:r>
     </w:p>
     <w:p>
@@ -484,7 +484,7 @@
         </w:numPr>
       </w:pPr>
       <w:r>
-        <w:t xml:space="preserve">El Modelo V tiene una mediana mayor que la del Modelo W y que la del Modelo M.</w:t>
+        <w:t xml:space="preserve">El Modelo U tiene una mediana mayor que la del Modelo A y menor que la del Modelo C.</w:t>
       </w:r>
     </w:p>
     <w:p>
@@ -495,7 +495,7 @@
         </w:numPr>
       </w:pPr>
       <w:r>
-        <w:t xml:space="preserve">El Modelo V tiene una mediana igual a la del Modelo M y menor que la del Modelo W.</w:t>
+        <w:t xml:space="preserve">El Modelo U tiene una mediana mayor que la del Modelo C y que la del Modelo A.</w:t>
       </w:r>
     </w:p>
     <w:p>
@@ -506,7 +506,7 @@
         </w:numPr>
       </w:pPr>
       <w:r>
-        <w:t xml:space="preserve">El Modelo V tiene una mediana mayor que la del Modelo M y menor que la del Modelo W.</w:t>
+        <w:t xml:space="preserve">El Modelo U tiene una mediana igual a la del Modelo A y menor que la del Modelo C.</w:t>
       </w:r>
     </w:p>
     <w:p>
@@ -527,7 +527,7 @@
         <w:br/>
       </w:r>
       <w:r>
-        <w:t xml:space="preserve">La respuesta correcta es: El Modelo V tiene una mediana igual a la del Modelo M y menor que la del Modelo W.</w:t>
+        <w:t xml:space="preserve">La respuesta correcta es: El Modelo U tiene una mediana igual a la del Modelo A y menor que la del Modelo C.</w:t>
       </w:r>
     </w:p>
     <w:p>
@@ -560,7 +560,7 @@
         </w:numPr>
       </w:pPr>
       <w:r>
-        <w:t xml:space="preserve">Modelo M: 700, 733, 774, 779, 795 → Mediana = 774</w:t>
+        <w:t xml:space="preserve">Modelo A: 738, 746, 760, 785, 787 → Mediana = 760</w:t>
       </w:r>
     </w:p>
     <w:p>
@@ -571,7 +571,7 @@
         </w:numPr>
       </w:pPr>
       <w:r>
-        <w:t xml:space="preserve">Modelo W: 538, 585, 778, 797, 804 → Mediana = 778</w:t>
+        <w:t xml:space="preserve">Modelo C: 649, 674, 764, 791, 870 → Mediana = 764</w:t>
       </w:r>
     </w:p>
     <w:p>
@@ -582,7 +582,7 @@
         </w:numPr>
       </w:pPr>
       <w:r>
-        <w:t xml:space="preserve">Modelo V: 690, 729, 774, 790, 809 → Mediana = 774</w:t>
+        <w:t xml:space="preserve">Modelo U: 726, 756, 760, 781, 792 → Mediana = 760</w:t>
       </w:r>
     </w:p>
     <w:p>
@@ -604,7 +604,7 @@
         </w:numPr>
       </w:pPr>
       <w:r>
-        <w:t xml:space="preserve">Mediana de Modelo V (774) = Mediana de Modelo M (774)</w:t>
+        <w:t xml:space="preserve">Mediana de Modelo U (760) = Mediana de Modelo A (760)</w:t>
       </w:r>
     </w:p>
     <w:p>
@@ -615,7 +615,7 @@
         </w:numPr>
       </w:pPr>
       <w:r>
-        <w:t xml:space="preserve">Mediana de Modelo V (774) &lt; Mediana de Modelo W (778)</w:t>
+        <w:t xml:space="preserve">Mediana de Modelo U (760) &lt; Mediana de Modelo C (764)</w:t>
       </w:r>
     </w:p>
     <w:p>
@@ -626,7 +626,7 @@
         </w:numPr>
       </w:pPr>
       <w:r>
-        <w:t xml:space="preserve">Por lo tanto, el Modelo V tiene una mediana igual a la del Modelo M y menor que la del Modelo W.</w:t>
+        <w:t xml:space="preserve">Por lo tanto, el Modelo U tiene una mediana igual a la del Modelo A y menor que la del Modelo C.</w:t>
       </w:r>
     </w:p>
     <w:p>
@@ -684,31 +684,31 @@
               <w:jc w:val="right"/>
             </w:pPr>
             <w:r>
-              <w:t xml:space="preserve">Modelo Q</w:t>
-            </w:r>
-          </w:p>
-        </w:tc>
-        <w:tc>
-          <w:tcPr/>
-          <w:p>
-            <w:pPr>
-              <w:pStyle w:val="Compact"/>
-              <w:jc w:val="right"/>
-            </w:pPr>
-            <w:r>
-              <w:t xml:space="preserve">Modelo M</w:t>
-            </w:r>
-          </w:p>
-        </w:tc>
-        <w:tc>
-          <w:tcPr/>
-          <w:p>
-            <w:pPr>
-              <w:pStyle w:val="Compact"/>
-              <w:jc w:val="right"/>
-            </w:pPr>
-            <w:r>
-              <w:t xml:space="preserve">Modelo H</w:t>
+              <w:t xml:space="preserve">Modelo C</w:t>
+            </w:r>
+          </w:p>
+        </w:tc>
+        <w:tc>
+          <w:tcPr/>
+          <w:p>
+            <w:pPr>
+              <w:pStyle w:val="Compact"/>
+              <w:jc w:val="right"/>
+            </w:pPr>
+            <w:r>
+              <w:t xml:space="preserve">Modelo B</w:t>
+            </w:r>
+          </w:p>
+        </w:tc>
+        <w:tc>
+          <w:tcPr/>
+          <w:p>
+            <w:pPr>
+              <w:pStyle w:val="Compact"/>
+              <w:jc w:val="right"/>
+            </w:pPr>
+            <w:r>
+              <w:t xml:space="preserve">Modelo L</w:t>
             </w:r>
           </w:p>
         </w:tc>
@@ -734,31 +734,31 @@
               <w:jc w:val="right"/>
             </w:pPr>
             <w:r>
-              <w:t xml:space="preserve">795</w:t>
-            </w:r>
-          </w:p>
-        </w:tc>
-        <w:tc>
-          <w:tcPr/>
-          <w:p>
-            <w:pPr>
-              <w:pStyle w:val="Compact"/>
-              <w:jc w:val="right"/>
-            </w:pPr>
-            <w:r>
-              <w:t xml:space="preserve">539</w:t>
-            </w:r>
-          </w:p>
-        </w:tc>
-        <w:tc>
-          <w:tcPr/>
-          <w:p>
-            <w:pPr>
-              <w:pStyle w:val="Compact"/>
-              <w:jc w:val="right"/>
-            </w:pPr>
-            <w:r>
-              <w:t xml:space="preserve">735</w:t>
+              <w:t xml:space="preserve">638</w:t>
+            </w:r>
+          </w:p>
+        </w:tc>
+        <w:tc>
+          <w:tcPr/>
+          <w:p>
+            <w:pPr>
+              <w:pStyle w:val="Compact"/>
+              <w:jc w:val="right"/>
+            </w:pPr>
+            <w:r>
+              <w:t xml:space="preserve">782</w:t>
+            </w:r>
+          </w:p>
+        </w:tc>
+        <w:tc>
+          <w:tcPr/>
+          <w:p>
+            <w:pPr>
+              <w:pStyle w:val="Compact"/>
+              <w:jc w:val="right"/>
+            </w:pPr>
+            <w:r>
+              <w:t xml:space="preserve">728</w:t>
             </w:r>
           </w:p>
         </w:tc>
@@ -784,31 +784,31 @@
               <w:jc w:val="right"/>
             </w:pPr>
             <w:r>
-              <w:t xml:space="preserve">532</w:t>
-            </w:r>
-          </w:p>
-        </w:tc>
-        <w:tc>
-          <w:tcPr/>
-          <w:p>
-            <w:pPr>
-              <w:pStyle w:val="Compact"/>
-              <w:jc w:val="right"/>
-            </w:pPr>
-            <w:r>
-              <w:t xml:space="preserve">555</w:t>
-            </w:r>
-          </w:p>
-        </w:tc>
-        <w:tc>
-          <w:tcPr/>
-          <w:p>
-            <w:pPr>
-              <w:pStyle w:val="Compact"/>
-              <w:jc w:val="right"/>
-            </w:pPr>
-            <w:r>
-              <w:t xml:space="preserve">742</w:t>
+              <w:t xml:space="preserve">648</w:t>
+            </w:r>
+          </w:p>
+        </w:tc>
+        <w:tc>
+          <w:tcPr/>
+          <w:p>
+            <w:pPr>
+              <w:pStyle w:val="Compact"/>
+              <w:jc w:val="right"/>
+            </w:pPr>
+            <w:r>
+              <w:t xml:space="preserve">719</w:t>
+            </w:r>
+          </w:p>
+        </w:tc>
+        <w:tc>
+          <w:tcPr/>
+          <w:p>
+            <w:pPr>
+              <w:pStyle w:val="Compact"/>
+              <w:jc w:val="right"/>
+            </w:pPr>
+            <w:r>
+              <w:t xml:space="preserve">651</w:t>
             </w:r>
           </w:p>
         </w:tc>
@@ -834,31 +834,31 @@
               <w:jc w:val="right"/>
             </w:pPr>
             <w:r>
-              <w:t xml:space="preserve">706</w:t>
-            </w:r>
-          </w:p>
-        </w:tc>
-        <w:tc>
-          <w:tcPr/>
-          <w:p>
-            <w:pPr>
-              <w:pStyle w:val="Compact"/>
-              <w:jc w:val="right"/>
-            </w:pPr>
-            <w:r>
-              <w:t xml:space="preserve">635</w:t>
-            </w:r>
-          </w:p>
-        </w:tc>
-        <w:tc>
-          <w:tcPr/>
-          <w:p>
-            <w:pPr>
-              <w:pStyle w:val="Compact"/>
-              <w:jc w:val="right"/>
-            </w:pPr>
-            <w:r>
-              <w:t xml:space="preserve">747</w:t>
+              <w:t xml:space="preserve">719</w:t>
+            </w:r>
+          </w:p>
+        </w:tc>
+        <w:tc>
+          <w:tcPr/>
+          <w:p>
+            <w:pPr>
+              <w:pStyle w:val="Compact"/>
+              <w:jc w:val="right"/>
+            </w:pPr>
+            <w:r>
+              <w:t xml:space="preserve">761</w:t>
+            </w:r>
+          </w:p>
+        </w:tc>
+        <w:tc>
+          <w:tcPr/>
+          <w:p>
+            <w:pPr>
+              <w:pStyle w:val="Compact"/>
+              <w:jc w:val="right"/>
+            </w:pPr>
+            <w:r>
+              <w:t xml:space="preserve">722</w:t>
             </w:r>
           </w:p>
         </w:tc>
@@ -884,31 +884,31 @@
               <w:jc w:val="right"/>
             </w:pPr>
             <w:r>
-              <w:t xml:space="preserve">635</w:t>
-            </w:r>
-          </w:p>
-        </w:tc>
-        <w:tc>
-          <w:tcPr/>
-          <w:p>
-            <w:pPr>
-              <w:pStyle w:val="Compact"/>
-              <w:jc w:val="right"/>
-            </w:pPr>
-            <w:r>
-              <w:t xml:space="preserve">718</w:t>
-            </w:r>
-          </w:p>
-        </w:tc>
-        <w:tc>
-          <w:tcPr/>
-          <w:p>
-            <w:pPr>
-              <w:pStyle w:val="Compact"/>
-              <w:jc w:val="right"/>
-            </w:pPr>
-            <w:r>
-              <w:t xml:space="preserve">581</w:t>
+              <w:t xml:space="preserve">756</w:t>
+            </w:r>
+          </w:p>
+        </w:tc>
+        <w:tc>
+          <w:tcPr/>
+          <w:p>
+            <w:pPr>
+              <w:pStyle w:val="Compact"/>
+              <w:jc w:val="right"/>
+            </w:pPr>
+            <w:r>
+              <w:t xml:space="preserve">640</w:t>
+            </w:r>
+          </w:p>
+        </w:tc>
+        <w:tc>
+          <w:tcPr/>
+          <w:p>
+            <w:pPr>
+              <w:pStyle w:val="Compact"/>
+              <w:jc w:val="right"/>
+            </w:pPr>
+            <w:r>
+              <w:t xml:space="preserve">760</w:t>
             </w:r>
           </w:p>
         </w:tc>
@@ -934,31 +934,31 @@
               <w:jc w:val="right"/>
             </w:pPr>
             <w:r>
-              <w:t xml:space="preserve">562</w:t>
-            </w:r>
-          </w:p>
-        </w:tc>
-        <w:tc>
-          <w:tcPr/>
-          <w:p>
-            <w:pPr>
-              <w:pStyle w:val="Compact"/>
-              <w:jc w:val="right"/>
-            </w:pPr>
-            <w:r>
-              <w:t xml:space="preserve">775</w:t>
-            </w:r>
-          </w:p>
-        </w:tc>
-        <w:tc>
-          <w:tcPr/>
-          <w:p>
-            <w:pPr>
-              <w:pStyle w:val="Compact"/>
-              <w:jc w:val="right"/>
-            </w:pPr>
-            <w:r>
-              <w:t xml:space="preserve">763</w:t>
+              <w:t xml:space="preserve">787</w:t>
+            </w:r>
+          </w:p>
+        </w:tc>
+        <w:tc>
+          <w:tcPr/>
+          <w:p>
+            <w:pPr>
+              <w:pStyle w:val="Compact"/>
+              <w:jc w:val="right"/>
+            </w:pPr>
+            <w:r>
+              <w:t xml:space="preserve">628</w:t>
+            </w:r>
+          </w:p>
+        </w:tc>
+        <w:tc>
+          <w:tcPr/>
+          <w:p>
+            <w:pPr>
+              <w:pStyle w:val="Compact"/>
+              <w:jc w:val="right"/>
+            </w:pPr>
+            <w:r>
+              <w:t xml:space="preserve">759</w:t>
             </w:r>
           </w:p>
         </w:tc>
@@ -983,7 +983,7 @@
         </w:numPr>
       </w:pPr>
       <w:r>
-        <w:t xml:space="preserve">El Modelo M tiene una mediana mayor que la del Modelo H y que la del Modelo Q.</w:t>
+        <w:t xml:space="preserve">El Modelo C tiene una mediana mayor que la del Modelo B y menor que la del Modelo L.</w:t>
       </w:r>
     </w:p>
     <w:p>
@@ -994,7 +994,7 @@
         </w:numPr>
       </w:pPr>
       <w:r>
-        <w:t xml:space="preserve">El Modelo M tiene una mediana mayor que la del Modelo Q y menor que la del Modelo H.</w:t>
+        <w:t xml:space="preserve">El Modelo C tiene una mediana igual a la del Modelo B y menor que la del Modelo L.</w:t>
       </w:r>
     </w:p>
     <w:p>
@@ -1005,7 +1005,7 @@
         </w:numPr>
       </w:pPr>
       <w:r>
-        <w:t xml:space="preserve">El Modelo M tiene una mediana igual a la del Modelo Q y menor que la del Modelo H.</w:t>
+        <w:t xml:space="preserve">El Modelo C tiene una mediana mayor que la del Modelo L y que la del Modelo B.</w:t>
       </w:r>
     </w:p>
     <w:p>
@@ -1016,7 +1016,7 @@
         </w:numPr>
       </w:pPr>
       <w:r>
-        <w:t xml:space="preserve">El Modelo M tiene una mediana igual a la del Modelo H y menor que la del Modelo Q.</w:t>
+        <w:t xml:space="preserve">El Modelo C tiene una mediana igual a la del Modelo L y menor que la del Modelo B.</w:t>
       </w:r>
     </w:p>
     <w:p>
@@ -1037,7 +1037,7 @@
         <w:br/>
       </w:r>
       <w:r>
-        <w:t xml:space="preserve">La respuesta correcta es: El Modelo M tiene una mediana igual a la del Modelo Q y menor que la del Modelo H.</w:t>
+        <w:t xml:space="preserve">La respuesta correcta es: El Modelo C tiene una mediana igual a la del Modelo B y menor que la del Modelo L.</w:t>
       </w:r>
     </w:p>
     <w:p>
@@ -1070,7 +1070,7 @@
         </w:numPr>
       </w:pPr>
       <w:r>
-        <w:t xml:space="preserve">Modelo Q: 532, 562, 635, 706, 795 → Mediana = 635</w:t>
+        <w:t xml:space="preserve">Modelo B: 628, 640, 719, 761, 782 → Mediana = 719</w:t>
       </w:r>
     </w:p>
     <w:p>
@@ -1081,7 +1081,7 @@
         </w:numPr>
       </w:pPr>
       <w:r>
-        <w:t xml:space="preserve">Modelo H: 581, 735, 742, 747, 763 → Mediana = 742</w:t>
+        <w:t xml:space="preserve">Modelo L: 651, 722, 728, 759, 760 → Mediana = 728</w:t>
       </w:r>
     </w:p>
     <w:p>
@@ -1092,7 +1092,7 @@
         </w:numPr>
       </w:pPr>
       <w:r>
-        <w:t xml:space="preserve">Modelo M: 539, 555, 635, 718, 775 → Mediana = 635</w:t>
+        <w:t xml:space="preserve">Modelo C: 638, 648, 719, 756, 787 → Mediana = 719</w:t>
       </w:r>
     </w:p>
     <w:p>
@@ -1114,7 +1114,7 @@
         </w:numPr>
       </w:pPr>
       <w:r>
-        <w:t xml:space="preserve">Mediana de Modelo M (635) = Mediana de Modelo Q (635)</w:t>
+        <w:t xml:space="preserve">Mediana de Modelo C (719) = Mediana de Modelo B (719)</w:t>
       </w:r>
     </w:p>
     <w:p>
@@ -1125,7 +1125,7 @@
         </w:numPr>
       </w:pPr>
       <w:r>
-        <w:t xml:space="preserve">Mediana de Modelo M (635) &lt; Mediana de Modelo H (742)</w:t>
+        <w:t xml:space="preserve">Mediana de Modelo C (719) &lt; Mediana de Modelo L (728)</w:t>
       </w:r>
     </w:p>
     <w:p>
@@ -1136,7 +1136,7 @@
         </w:numPr>
       </w:pPr>
       <w:r>
-        <w:t xml:space="preserve">Por lo tanto, el Modelo M tiene una mediana igual a la del Modelo Q y menor que la del Modelo H.</w:t>
+        <w:t xml:space="preserve">Por lo tanto, el Modelo C tiene una mediana igual a la del Modelo B y menor que la del Modelo L.</w:t>
       </w:r>
     </w:p>
     <w:p>
@@ -1194,31 +1194,31 @@
               <w:jc w:val="right"/>
             </w:pPr>
             <w:r>
-              <w:t xml:space="preserve">Modelo J</w:t>
-            </w:r>
-          </w:p>
-        </w:tc>
-        <w:tc>
-          <w:tcPr/>
-          <w:p>
-            <w:pPr>
-              <w:pStyle w:val="Compact"/>
-              <w:jc w:val="right"/>
-            </w:pPr>
-            <w:r>
-              <w:t xml:space="preserve">Modelo G</w:t>
-            </w:r>
-          </w:p>
-        </w:tc>
-        <w:tc>
-          <w:tcPr/>
-          <w:p>
-            <w:pPr>
-              <w:pStyle w:val="Compact"/>
-              <w:jc w:val="right"/>
-            </w:pPr>
-            <w:r>
-              <w:t xml:space="preserve">Modelo T</w:t>
+              <w:t xml:space="preserve">Modelo H</w:t>
+            </w:r>
+          </w:p>
+        </w:tc>
+        <w:tc>
+          <w:tcPr/>
+          <w:p>
+            <w:pPr>
+              <w:pStyle w:val="Compact"/>
+              <w:jc w:val="right"/>
+            </w:pPr>
+            <w:r>
+              <w:t xml:space="preserve">Modelo F</w:t>
+            </w:r>
+          </w:p>
+        </w:tc>
+        <w:tc>
+          <w:tcPr/>
+          <w:p>
+            <w:pPr>
+              <w:pStyle w:val="Compact"/>
+              <w:jc w:val="right"/>
+            </w:pPr>
+            <w:r>
+              <w:t xml:space="preserve">Modelo V</w:t>
             </w:r>
           </w:p>
         </w:tc>
@@ -1244,31 +1244,31 @@
               <w:jc w:val="right"/>
             </w:pPr>
             <w:r>
-              <w:t xml:space="preserve">671</w:t>
-            </w:r>
-          </w:p>
-        </w:tc>
-        <w:tc>
-          <w:tcPr/>
-          <w:p>
-            <w:pPr>
-              <w:pStyle w:val="Compact"/>
-              <w:jc w:val="right"/>
-            </w:pPr>
-            <w:r>
-              <w:t xml:space="preserve">798</w:t>
-            </w:r>
-          </w:p>
-        </w:tc>
-        <w:tc>
-          <w:tcPr/>
-          <w:p>
-            <w:pPr>
-              <w:pStyle w:val="Compact"/>
-              <w:jc w:val="right"/>
-            </w:pPr>
-            <w:r>
-              <w:t xml:space="preserve">557</w:t>
+              <w:t xml:space="preserve">551</w:t>
+            </w:r>
+          </w:p>
+        </w:tc>
+        <w:tc>
+          <w:tcPr/>
+          <w:p>
+            <w:pPr>
+              <w:pStyle w:val="Compact"/>
+              <w:jc w:val="right"/>
+            </w:pPr>
+            <w:r>
+              <w:t xml:space="preserve">651</w:t>
+            </w:r>
+          </w:p>
+        </w:tc>
+        <w:tc>
+          <w:tcPr/>
+          <w:p>
+            <w:pPr>
+              <w:pStyle w:val="Compact"/>
+              <w:jc w:val="right"/>
+            </w:pPr>
+            <w:r>
+              <w:t xml:space="preserve">638</w:t>
             </w:r>
           </w:p>
         </w:tc>
@@ -1294,31 +1294,31 @@
               <w:jc w:val="right"/>
             </w:pPr>
             <w:r>
-              <w:t xml:space="preserve">568</w:t>
-            </w:r>
-          </w:p>
-        </w:tc>
-        <w:tc>
-          <w:tcPr/>
-          <w:p>
-            <w:pPr>
-              <w:pStyle w:val="Compact"/>
-              <w:jc w:val="right"/>
-            </w:pPr>
-            <w:r>
-              <w:t xml:space="preserve">562</w:t>
-            </w:r>
-          </w:p>
-        </w:tc>
-        <w:tc>
-          <w:tcPr/>
-          <w:p>
-            <w:pPr>
-              <w:pStyle w:val="Compact"/>
-              <w:jc w:val="right"/>
-            </w:pPr>
-            <w:r>
-              <w:t xml:space="preserve">588</w:t>
+              <w:t xml:space="preserve">590</w:t>
+            </w:r>
+          </w:p>
+        </w:tc>
+        <w:tc>
+          <w:tcPr/>
+          <w:p>
+            <w:pPr>
+              <w:pStyle w:val="Compact"/>
+              <w:jc w:val="right"/>
+            </w:pPr>
+            <w:r>
+              <w:t xml:space="preserve">670</w:t>
+            </w:r>
+          </w:p>
+        </w:tc>
+        <w:tc>
+          <w:tcPr/>
+          <w:p>
+            <w:pPr>
+              <w:pStyle w:val="Compact"/>
+              <w:jc w:val="right"/>
+            </w:pPr>
+            <w:r>
+              <w:t xml:space="preserve">636</w:t>
             </w:r>
           </w:p>
         </w:tc>
@@ -1344,31 +1344,31 @@
               <w:jc w:val="right"/>
             </w:pPr>
             <w:r>
-              <w:t xml:space="preserve">526</w:t>
-            </w:r>
-          </w:p>
-        </w:tc>
-        <w:tc>
-          <w:tcPr/>
-          <w:p>
-            <w:pPr>
-              <w:pStyle w:val="Compact"/>
-              <w:jc w:val="right"/>
-            </w:pPr>
-            <w:r>
-              <w:t xml:space="preserve">588</w:t>
-            </w:r>
-          </w:p>
-        </w:tc>
-        <w:tc>
-          <w:tcPr/>
-          <w:p>
-            <w:pPr>
-              <w:pStyle w:val="Compact"/>
-              <w:jc w:val="right"/>
-            </w:pPr>
-            <w:r>
-              <w:t xml:space="preserve">585</w:t>
+              <w:t xml:space="preserve">636</w:t>
+            </w:r>
+          </w:p>
+        </w:tc>
+        <w:tc>
+          <w:tcPr/>
+          <w:p>
+            <w:pPr>
+              <w:pStyle w:val="Compact"/>
+              <w:jc w:val="right"/>
+            </w:pPr>
+            <w:r>
+              <w:t xml:space="preserve">530</w:t>
+            </w:r>
+          </w:p>
+        </w:tc>
+        <w:tc>
+          <w:tcPr/>
+          <w:p>
+            <w:pPr>
+              <w:pStyle w:val="Compact"/>
+              <w:jc w:val="right"/>
+            </w:pPr>
+            <w:r>
+              <w:t xml:space="preserve">590</w:t>
             </w:r>
           </w:p>
         </w:tc>
@@ -1394,31 +1394,31 @@
               <w:jc w:val="right"/>
             </w:pPr>
             <w:r>
-              <w:t xml:space="preserve">785</w:t>
-            </w:r>
-          </w:p>
-        </w:tc>
-        <w:tc>
-          <w:tcPr/>
-          <w:p>
-            <w:pPr>
-              <w:pStyle w:val="Compact"/>
-              <w:jc w:val="right"/>
-            </w:pPr>
-            <w:r>
-              <w:t xml:space="preserve">575</w:t>
-            </w:r>
-          </w:p>
-        </w:tc>
-        <w:tc>
-          <w:tcPr/>
-          <w:p>
-            <w:pPr>
-              <w:pStyle w:val="Compact"/>
-              <w:jc w:val="right"/>
-            </w:pPr>
-            <w:r>
-              <w:t xml:space="preserve">646</w:t>
+              <w:t xml:space="preserve">643</w:t>
+            </w:r>
+          </w:p>
+        </w:tc>
+        <w:tc>
+          <w:tcPr/>
+          <w:p>
+            <w:pPr>
+              <w:pStyle w:val="Compact"/>
+              <w:jc w:val="right"/>
+            </w:pPr>
+            <w:r>
+              <w:t xml:space="preserve">573</w:t>
+            </w:r>
+          </w:p>
+        </w:tc>
+        <w:tc>
+          <w:tcPr/>
+          <w:p>
+            <w:pPr>
+              <w:pStyle w:val="Compact"/>
+              <w:jc w:val="right"/>
+            </w:pPr>
+            <w:r>
+              <w:t xml:space="preserve">714</w:t>
             </w:r>
           </w:p>
         </w:tc>
@@ -1444,31 +1444,31 @@
               <w:jc w:val="right"/>
             </w:pPr>
             <w:r>
-              <w:t xml:space="preserve">781</w:t>
-            </w:r>
-          </w:p>
-        </w:tc>
-        <w:tc>
-          <w:tcPr/>
-          <w:p>
-            <w:pPr>
-              <w:pStyle w:val="Compact"/>
-              <w:jc w:val="right"/>
-            </w:pPr>
-            <w:r>
-              <w:t xml:space="preserve">630</w:t>
-            </w:r>
-          </w:p>
-        </w:tc>
-        <w:tc>
-          <w:tcPr/>
-          <w:p>
-            <w:pPr>
-              <w:pStyle w:val="Compact"/>
-              <w:jc w:val="right"/>
-            </w:pPr>
-            <w:r>
-              <w:t xml:space="preserve">806</w:t>
+              <w:t xml:space="preserve">725</w:t>
+            </w:r>
+          </w:p>
+        </w:tc>
+        <w:tc>
+          <w:tcPr/>
+          <w:p>
+            <w:pPr>
+              <w:pStyle w:val="Compact"/>
+              <w:jc w:val="right"/>
+            </w:pPr>
+            <w:r>
+              <w:t xml:space="preserve">670</w:t>
+            </w:r>
+          </w:p>
+        </w:tc>
+        <w:tc>
+          <w:tcPr/>
+          <w:p>
+            <w:pPr>
+              <w:pStyle w:val="Compact"/>
+              <w:jc w:val="right"/>
+            </w:pPr>
+            <w:r>
+              <w:t xml:space="preserve">534</w:t>
             </w:r>
           </w:p>
         </w:tc>
@@ -1493,7 +1493,7 @@
         </w:numPr>
       </w:pPr>
       <w:r>
-        <w:t xml:space="preserve">El Modelo T tiene una mediana igual a la del Modelo J y menor que la del Modelo G.</w:t>
+        <w:t xml:space="preserve">El Modelo H tiene una mediana igual a la del Modelo V y menor que la del Modelo F.</w:t>
       </w:r>
     </w:p>
     <w:p>
@@ -1504,7 +1504,7 @@
         </w:numPr>
       </w:pPr>
       <w:r>
-        <w:t xml:space="preserve">El Modelo T tiene una mediana mayor que la del Modelo J y que la del Modelo G.</w:t>
+        <w:t xml:space="preserve">El Modelo H tiene una mediana mayor que la del Modelo F y que la del Modelo V.</w:t>
       </w:r>
     </w:p>
     <w:p>
@@ -1515,7 +1515,7 @@
         </w:numPr>
       </w:pPr>
       <w:r>
-        <w:t xml:space="preserve">El Modelo T tiene una mediana igual a la del Modelo G y menor que la del Modelo J.</w:t>
+        <w:t xml:space="preserve">El Modelo H tiene una mediana igual a la del Modelo F y menor que la del Modelo V.</w:t>
       </w:r>
     </w:p>
     <w:p>
@@ -1526,7 +1526,7 @@
         </w:numPr>
       </w:pPr>
       <w:r>
-        <w:t xml:space="preserve">El Modelo T tiene una mediana mayor que la del Modelo G y menor que la del Modelo J.</w:t>
+        <w:t xml:space="preserve">El Modelo H tiene una mediana mayor que la del Modelo V y menor que la del Modelo F.</w:t>
       </w:r>
     </w:p>
     <w:p>
@@ -1547,7 +1547,7 @@
         <w:br/>
       </w:r>
       <w:r>
-        <w:t xml:space="preserve">La respuesta correcta es: El Modelo T tiene una mediana igual a la del Modelo G y menor que la del Modelo J.</w:t>
+        <w:t xml:space="preserve">La respuesta correcta es: El Modelo H tiene una mediana igual a la del Modelo V y menor que la del Modelo F.</w:t>
       </w:r>
     </w:p>
     <w:p>
@@ -1580,7 +1580,7 @@
         </w:numPr>
       </w:pPr>
       <w:r>
-        <w:t xml:space="preserve">Modelo G: 562, 575, 588, 630, 798 → Mediana = 588</w:t>
+        <w:t xml:space="preserve">Modelo V: 534, 590, 636, 638, 714 → Mediana = 636</w:t>
       </w:r>
     </w:p>
     <w:p>
@@ -1591,7 +1591,7 @@
         </w:numPr>
       </w:pPr>
       <w:r>
-        <w:t xml:space="preserve">Modelo J: 526, 568, 671, 781, 785 → Mediana = 671</w:t>
+        <w:t xml:space="preserve">Modelo F: 530, 573, 651, 670, 670 → Mediana = 651</w:t>
       </w:r>
     </w:p>
     <w:p>
@@ -1602,7 +1602,7 @@
         </w:numPr>
       </w:pPr>
       <w:r>
-        <w:t xml:space="preserve">Modelo T: 557, 585, 588, 646, 806 → Mediana = 588</w:t>
+        <w:t xml:space="preserve">Modelo H: 551, 590, 636, 643, 725 → Mediana = 636</w:t>
       </w:r>
     </w:p>
     <w:p>
@@ -1624,7 +1624,7 @@
         </w:numPr>
       </w:pPr>
       <w:r>
-        <w:t xml:space="preserve">Mediana de Modelo T (588) = Mediana de Modelo G (588)</w:t>
+        <w:t xml:space="preserve">Mediana de Modelo H (636) = Mediana de Modelo V (636)</w:t>
       </w:r>
     </w:p>
     <w:p>
@@ -1635,7 +1635,7 @@
         </w:numPr>
       </w:pPr>
       <w:r>
-        <w:t xml:space="preserve">Mediana de Modelo T (588) &lt; Mediana de Modelo J (671)</w:t>
+        <w:t xml:space="preserve">Mediana de Modelo H (636) &lt; Mediana de Modelo F (651)</w:t>
       </w:r>
     </w:p>
     <w:p>
@@ -1646,7 +1646,1027 @@
         </w:numPr>
       </w:pPr>
       <w:r>
-        <w:t xml:space="preserve">Por lo tanto, el Modelo T tiene una mediana igual a la del Modelo G y menor que la del Modelo J.</w:t>
+        <w:t xml:space="preserve">Por lo tanto, el Modelo H tiene una mediana igual a la del Modelo V y menor que la del Modelo F.</w:t>
+      </w:r>
+    </w:p>
+    <w:p>
+      <w:pPr>
+        <w:numPr>
+          <w:ilvl w:val="0"/>
+          <w:numId w:val="1001"/>
+        </w:numPr>
+      </w:pPr>
+      <w:r>
+        <w:rPr>
+          <w:b/>
+          <w:bCs/>
+        </w:rPr>
+        <w:t xml:space="preserve">Escenario</w:t>
+      </w:r>
+      <w:r>
+        <w:br/>
+      </w:r>
+      <w:r>
+        <w:t xml:space="preserve">La empresa TechLife realizó pruebas de rendimiento en tres modelos de teléfonos celulares. La siguiente tabla muestra la duración de la batería (en minutos) para cada modelo durante cinco pruebas diferentes:</w:t>
+      </w:r>
+    </w:p>
+    <w:tbl>
+      <w:tblPr>
+        <w:tblStyle w:val="Table"/>
+        <w:tblW w:type="auto" w:w="0"/>
+        <w:jc w:val="left"/>
+        <w:tblInd w:w="720" w:type="dxa"/>
+        <w:tblLook w:firstRow="1" w:lastRow="0" w:firstColumn="0" w:lastColumn="0" w:noHBand="0" w:noVBand="0" w:val="0020"/>
+      </w:tblPr>
+      <w:tblGrid>
+        <w:gridCol w:w="1980"/>
+        <w:gridCol w:w="1980"/>
+        <w:gridCol w:w="1980"/>
+        <w:gridCol w:w="1980"/>
+      </w:tblGrid>
+      <w:tr>
+        <w:trPr>
+          <w:tblHeader w:val="on"/>
+        </w:trPr>
+        <w:tc>
+          <w:tcPr/>
+          <w:p>
+            <w:pPr>
+              <w:pStyle w:val="Compact"/>
+            </w:pPr>
+          </w:p>
+        </w:tc>
+        <w:tc>
+          <w:tcPr/>
+          <w:p>
+            <w:pPr>
+              <w:pStyle w:val="Compact"/>
+              <w:jc w:val="right"/>
+            </w:pPr>
+            <w:r>
+              <w:t xml:space="preserve">Modelo S</w:t>
+            </w:r>
+          </w:p>
+        </w:tc>
+        <w:tc>
+          <w:tcPr/>
+          <w:p>
+            <w:pPr>
+              <w:pStyle w:val="Compact"/>
+              <w:jc w:val="right"/>
+            </w:pPr>
+            <w:r>
+              <w:t xml:space="preserve">Modelo J</w:t>
+            </w:r>
+          </w:p>
+        </w:tc>
+        <w:tc>
+          <w:tcPr/>
+          <w:p>
+            <w:pPr>
+              <w:pStyle w:val="Compact"/>
+              <w:jc w:val="right"/>
+            </w:pPr>
+            <w:r>
+              <w:t xml:space="preserve">Modelo K</w:t>
+            </w:r>
+          </w:p>
+        </w:tc>
+      </w:tr>
+      <w:tr>
+        <w:tc>
+          <w:tcPr/>
+          <w:p>
+            <w:pPr>
+              <w:pStyle w:val="Compact"/>
+              <w:jc w:val="left"/>
+            </w:pPr>
+            <w:r>
+              <w:t xml:space="preserve">Prueba 1</w:t>
+            </w:r>
+          </w:p>
+        </w:tc>
+        <w:tc>
+          <w:tcPr/>
+          <w:p>
+            <w:pPr>
+              <w:pStyle w:val="Compact"/>
+              <w:jc w:val="right"/>
+            </w:pPr>
+            <w:r>
+              <w:t xml:space="preserve">528</w:t>
+            </w:r>
+          </w:p>
+        </w:tc>
+        <w:tc>
+          <w:tcPr/>
+          <w:p>
+            <w:pPr>
+              <w:pStyle w:val="Compact"/>
+              <w:jc w:val="right"/>
+            </w:pPr>
+            <w:r>
+              <w:t xml:space="preserve">777</w:t>
+            </w:r>
+          </w:p>
+        </w:tc>
+        <w:tc>
+          <w:tcPr/>
+          <w:p>
+            <w:pPr>
+              <w:pStyle w:val="Compact"/>
+              <w:jc w:val="right"/>
+            </w:pPr>
+            <w:r>
+              <w:t xml:space="preserve">505</w:t>
+            </w:r>
+          </w:p>
+        </w:tc>
+      </w:tr>
+      <w:tr>
+        <w:tc>
+          <w:tcPr/>
+          <w:p>
+            <w:pPr>
+              <w:pStyle w:val="Compact"/>
+              <w:jc w:val="left"/>
+            </w:pPr>
+            <w:r>
+              <w:t xml:space="preserve">Prueba 2</w:t>
+            </w:r>
+          </w:p>
+        </w:tc>
+        <w:tc>
+          <w:tcPr/>
+          <w:p>
+            <w:pPr>
+              <w:pStyle w:val="Compact"/>
+              <w:jc w:val="right"/>
+            </w:pPr>
+            <w:r>
+              <w:t xml:space="preserve">649</w:t>
+            </w:r>
+          </w:p>
+        </w:tc>
+        <w:tc>
+          <w:tcPr/>
+          <w:p>
+            <w:pPr>
+              <w:pStyle w:val="Compact"/>
+              <w:jc w:val="right"/>
+            </w:pPr>
+            <w:r>
+              <w:t xml:space="preserve">799</w:t>
+            </w:r>
+          </w:p>
+        </w:tc>
+        <w:tc>
+          <w:tcPr/>
+          <w:p>
+            <w:pPr>
+              <w:pStyle w:val="Compact"/>
+              <w:jc w:val="right"/>
+            </w:pPr>
+            <w:r>
+              <w:t xml:space="preserve">600</w:t>
+            </w:r>
+          </w:p>
+        </w:tc>
+      </w:tr>
+      <w:tr>
+        <w:tc>
+          <w:tcPr/>
+          <w:p>
+            <w:pPr>
+              <w:pStyle w:val="Compact"/>
+              <w:jc w:val="left"/>
+            </w:pPr>
+            <w:r>
+              <w:t xml:space="preserve">Prueba 3</w:t>
+            </w:r>
+          </w:p>
+        </w:tc>
+        <w:tc>
+          <w:tcPr/>
+          <w:p>
+            <w:pPr>
+              <w:pStyle w:val="Compact"/>
+              <w:jc w:val="right"/>
+            </w:pPr>
+            <w:r>
+              <w:t xml:space="preserve">807</w:t>
+            </w:r>
+          </w:p>
+        </w:tc>
+        <w:tc>
+          <w:tcPr/>
+          <w:p>
+            <w:pPr>
+              <w:pStyle w:val="Compact"/>
+              <w:jc w:val="right"/>
+            </w:pPr>
+            <w:r>
+              <w:t xml:space="preserve">645</w:t>
+            </w:r>
+          </w:p>
+        </w:tc>
+        <w:tc>
+          <w:tcPr/>
+          <w:p>
+            <w:pPr>
+              <w:pStyle w:val="Compact"/>
+              <w:jc w:val="right"/>
+            </w:pPr>
+            <w:r>
+              <w:t xml:space="preserve">645</w:t>
+            </w:r>
+          </w:p>
+        </w:tc>
+      </w:tr>
+      <w:tr>
+        <w:tc>
+          <w:tcPr/>
+          <w:p>
+            <w:pPr>
+              <w:pStyle w:val="Compact"/>
+              <w:jc w:val="left"/>
+            </w:pPr>
+            <w:r>
+              <w:t xml:space="preserve">Prueba 4</w:t>
+            </w:r>
+          </w:p>
+        </w:tc>
+        <w:tc>
+          <w:tcPr/>
+          <w:p>
+            <w:pPr>
+              <w:pStyle w:val="Compact"/>
+              <w:jc w:val="right"/>
+            </w:pPr>
+            <w:r>
+              <w:t xml:space="preserve">590</w:t>
+            </w:r>
+          </w:p>
+        </w:tc>
+        <w:tc>
+          <w:tcPr/>
+          <w:p>
+            <w:pPr>
+              <w:pStyle w:val="Compact"/>
+              <w:jc w:val="right"/>
+            </w:pPr>
+            <w:r>
+              <w:t xml:space="preserve">615</w:t>
+            </w:r>
+          </w:p>
+        </w:tc>
+        <w:tc>
+          <w:tcPr/>
+          <w:p>
+            <w:pPr>
+              <w:pStyle w:val="Compact"/>
+              <w:jc w:val="right"/>
+            </w:pPr>
+            <w:r>
+              <w:t xml:space="preserve">796</w:t>
+            </w:r>
+          </w:p>
+        </w:tc>
+      </w:tr>
+      <w:tr>
+        <w:tc>
+          <w:tcPr/>
+          <w:p>
+            <w:pPr>
+              <w:pStyle w:val="Compact"/>
+              <w:jc w:val="left"/>
+            </w:pPr>
+            <w:r>
+              <w:t xml:space="preserve">Prueba 5</w:t>
+            </w:r>
+          </w:p>
+        </w:tc>
+        <w:tc>
+          <w:tcPr/>
+          <w:p>
+            <w:pPr>
+              <w:pStyle w:val="Compact"/>
+              <w:jc w:val="right"/>
+            </w:pPr>
+            <w:r>
+              <w:t xml:space="preserve">771</w:t>
+            </w:r>
+          </w:p>
+        </w:tc>
+        <w:tc>
+          <w:tcPr/>
+          <w:p>
+            <w:pPr>
+              <w:pStyle w:val="Compact"/>
+              <w:jc w:val="right"/>
+            </w:pPr>
+            <w:r>
+              <w:t xml:space="preserve">519</w:t>
+            </w:r>
+          </w:p>
+        </w:tc>
+        <w:tc>
+          <w:tcPr/>
+          <w:p>
+            <w:pPr>
+              <w:pStyle w:val="Compact"/>
+              <w:jc w:val="right"/>
+            </w:pPr>
+            <w:r>
+              <w:t xml:space="preserve">793</w:t>
+            </w:r>
+          </w:p>
+        </w:tc>
+      </w:tr>
+    </w:tbl>
+    <w:p>
+      <w:pPr>
+        <w:numPr>
+          <w:ilvl w:val="0"/>
+          <w:numId w:val="1000"/>
+        </w:numPr>
+      </w:pPr>
+      <w:r>
+        <w:t xml:space="preserve">Al comparar la mediana de las duraciones de la batería de los tres modelos, ¿cuál de las siguientes afirmaciones es correcta?</w:t>
+      </w:r>
+    </w:p>
+    <w:p>
+      <w:pPr>
+        <w:numPr>
+          <w:ilvl w:val="1"/>
+          <w:numId w:val="1017"/>
+        </w:numPr>
+      </w:pPr>
+      <w:r>
+        <w:t xml:space="preserve">El Modelo K tiene una mediana mayor que la del Modelo S y que la del Modelo J.</w:t>
+      </w:r>
+    </w:p>
+    <w:p>
+      <w:pPr>
+        <w:numPr>
+          <w:ilvl w:val="1"/>
+          <w:numId w:val="1017"/>
+        </w:numPr>
+      </w:pPr>
+      <w:r>
+        <w:t xml:space="preserve">El Modelo K tiene una mediana igual a la del Modelo S y menor que la del Modelo J.</w:t>
+      </w:r>
+    </w:p>
+    <w:p>
+      <w:pPr>
+        <w:numPr>
+          <w:ilvl w:val="1"/>
+          <w:numId w:val="1017"/>
+        </w:numPr>
+      </w:pPr>
+      <w:r>
+        <w:t xml:space="preserve">El Modelo K tiene una mediana mayor que la del Modelo J y menor que la del Modelo S.</w:t>
+      </w:r>
+    </w:p>
+    <w:p>
+      <w:pPr>
+        <w:numPr>
+          <w:ilvl w:val="1"/>
+          <w:numId w:val="1017"/>
+        </w:numPr>
+      </w:pPr>
+      <w:r>
+        <w:t xml:space="preserve">El Modelo K tiene una mediana igual a la del Modelo J y menor que la del Modelo S.</w:t>
+      </w:r>
+    </w:p>
+    <w:p>
+      <w:pPr>
+        <w:numPr>
+          <w:ilvl w:val="0"/>
+          <w:numId w:val="1000"/>
+        </w:numPr>
+      </w:pPr>
+      <w:r>
+        <w:rPr>
+          <w:b/>
+          <w:bCs/>
+        </w:rPr>
+        <w:t xml:space="preserve">Solución</w:t>
+      </w:r>
+      <w:r>
+        <w:br/>
+      </w:r>
+      <w:r>
+        <w:t xml:space="preserve">La respuesta correcta es: El Modelo K tiene una mediana igual a la del Modelo J y menor que la del Modelo S.</w:t>
+      </w:r>
+    </w:p>
+    <w:p>
+      <w:pPr>
+        <w:numPr>
+          <w:ilvl w:val="0"/>
+          <w:numId w:val="1000"/>
+        </w:numPr>
+      </w:pPr>
+      <w:r>
+        <w:t xml:space="preserve">Para resolver este problema, debemos:</w:t>
+      </w:r>
+    </w:p>
+    <w:p>
+      <w:pPr>
+        <w:numPr>
+          <w:ilvl w:val="1"/>
+          <w:numId w:val="1018"/>
+        </w:numPr>
+      </w:pPr>
+      <w:r>
+        <w:t xml:space="preserve">Ordenar los datos de cada modelo y encontrar su mediana:</w:t>
+      </w:r>
+    </w:p>
+    <w:p>
+      <w:pPr>
+        <w:numPr>
+          <w:ilvl w:val="1"/>
+          <w:numId w:val="1019"/>
+        </w:numPr>
+      </w:pPr>
+      <w:r>
+        <w:t xml:space="preserve">Modelo J: 519, 615, 645, 777, 799 → Mediana = 645</w:t>
+      </w:r>
+    </w:p>
+    <w:p>
+      <w:pPr>
+        <w:numPr>
+          <w:ilvl w:val="1"/>
+          <w:numId w:val="1019"/>
+        </w:numPr>
+      </w:pPr>
+      <w:r>
+        <w:t xml:space="preserve">Modelo S: 528, 590, 649, 771, 807 → Mediana = 649</w:t>
+      </w:r>
+    </w:p>
+    <w:p>
+      <w:pPr>
+        <w:numPr>
+          <w:ilvl w:val="1"/>
+          <w:numId w:val="1019"/>
+        </w:numPr>
+      </w:pPr>
+      <w:r>
+        <w:t xml:space="preserve">Modelo K: 505, 600, 645, 793, 796 → Mediana = 645</w:t>
+      </w:r>
+    </w:p>
+    <w:p>
+      <w:pPr>
+        <w:numPr>
+          <w:ilvl w:val="1"/>
+          <w:numId w:val="1020"/>
+        </w:numPr>
+      </w:pPr>
+      <w:r>
+        <w:t xml:space="preserve">Comparar las medianas:</w:t>
+      </w:r>
+    </w:p>
+    <w:p>
+      <w:pPr>
+        <w:numPr>
+          <w:ilvl w:val="1"/>
+          <w:numId w:val="1021"/>
+        </w:numPr>
+      </w:pPr>
+      <w:r>
+        <w:t xml:space="preserve">Mediana de Modelo K (645) = Mediana de Modelo J (645)</w:t>
+      </w:r>
+    </w:p>
+    <w:p>
+      <w:pPr>
+        <w:numPr>
+          <w:ilvl w:val="1"/>
+          <w:numId w:val="1021"/>
+        </w:numPr>
+      </w:pPr>
+      <w:r>
+        <w:t xml:space="preserve">Mediana de Modelo K (645) &lt; Mediana de Modelo S (649)</w:t>
+      </w:r>
+    </w:p>
+    <w:p>
+      <w:pPr>
+        <w:numPr>
+          <w:ilvl w:val="0"/>
+          <w:numId w:val="1000"/>
+        </w:numPr>
+      </w:pPr>
+      <w:r>
+        <w:t xml:space="preserve">Por lo tanto, el Modelo K tiene una mediana igual a la del Modelo J y menor que la del Modelo S.</w:t>
+      </w:r>
+    </w:p>
+    <w:p>
+      <w:pPr>
+        <w:numPr>
+          <w:ilvl w:val="0"/>
+          <w:numId w:val="1001"/>
+        </w:numPr>
+      </w:pPr>
+      <w:r>
+        <w:rPr>
+          <w:b/>
+          <w:bCs/>
+        </w:rPr>
+        <w:t xml:space="preserve">Escenario</w:t>
+      </w:r>
+      <w:r>
+        <w:br/>
+      </w:r>
+      <w:r>
+        <w:t xml:space="preserve">La empresa MobilPro realizó pruebas de rendimiento en tres modelos de teléfonos celulares. La siguiente tabla muestra la duración de la batería (en minutos) para cada modelo durante cinco pruebas diferentes:</w:t>
+      </w:r>
+    </w:p>
+    <w:tbl>
+      <w:tblPr>
+        <w:tblStyle w:val="Table"/>
+        <w:tblW w:type="auto" w:w="0"/>
+        <w:jc w:val="left"/>
+        <w:tblInd w:w="720" w:type="dxa"/>
+        <w:tblLook w:firstRow="1" w:lastRow="0" w:firstColumn="0" w:lastColumn="0" w:noHBand="0" w:noVBand="0" w:val="0020"/>
+      </w:tblPr>
+      <w:tblGrid>
+        <w:gridCol w:w="1980"/>
+        <w:gridCol w:w="1980"/>
+        <w:gridCol w:w="1980"/>
+        <w:gridCol w:w="1980"/>
+      </w:tblGrid>
+      <w:tr>
+        <w:trPr>
+          <w:tblHeader w:val="on"/>
+        </w:trPr>
+        <w:tc>
+          <w:tcPr/>
+          <w:p>
+            <w:pPr>
+              <w:pStyle w:val="Compact"/>
+            </w:pPr>
+          </w:p>
+        </w:tc>
+        <w:tc>
+          <w:tcPr/>
+          <w:p>
+            <w:pPr>
+              <w:pStyle w:val="Compact"/>
+              <w:jc w:val="right"/>
+            </w:pPr>
+            <w:r>
+              <w:t xml:space="preserve">Modelo V</w:t>
+            </w:r>
+          </w:p>
+        </w:tc>
+        <w:tc>
+          <w:tcPr/>
+          <w:p>
+            <w:pPr>
+              <w:pStyle w:val="Compact"/>
+              <w:jc w:val="right"/>
+            </w:pPr>
+            <w:r>
+              <w:t xml:space="preserve">Modelo Q</w:t>
+            </w:r>
+          </w:p>
+        </w:tc>
+        <w:tc>
+          <w:tcPr/>
+          <w:p>
+            <w:pPr>
+              <w:pStyle w:val="Compact"/>
+              <w:jc w:val="right"/>
+            </w:pPr>
+            <w:r>
+              <w:t xml:space="preserve">Modelo M</w:t>
+            </w:r>
+          </w:p>
+        </w:tc>
+      </w:tr>
+      <w:tr>
+        <w:tc>
+          <w:tcPr/>
+          <w:p>
+            <w:pPr>
+              <w:pStyle w:val="Compact"/>
+              <w:jc w:val="left"/>
+            </w:pPr>
+            <w:r>
+              <w:t xml:space="preserve">Prueba 1</w:t>
+            </w:r>
+          </w:p>
+        </w:tc>
+        <w:tc>
+          <w:tcPr/>
+          <w:p>
+            <w:pPr>
+              <w:pStyle w:val="Compact"/>
+              <w:jc w:val="right"/>
+            </w:pPr>
+            <w:r>
+              <w:t xml:space="preserve">622</w:t>
+            </w:r>
+          </w:p>
+        </w:tc>
+        <w:tc>
+          <w:tcPr/>
+          <w:p>
+            <w:pPr>
+              <w:pStyle w:val="Compact"/>
+              <w:jc w:val="right"/>
+            </w:pPr>
+            <w:r>
+              <w:t xml:space="preserve">512</w:t>
+            </w:r>
+          </w:p>
+        </w:tc>
+        <w:tc>
+          <w:tcPr/>
+          <w:p>
+            <w:pPr>
+              <w:pStyle w:val="Compact"/>
+              <w:jc w:val="right"/>
+            </w:pPr>
+            <w:r>
+              <w:t xml:space="preserve">619</w:t>
+            </w:r>
+          </w:p>
+        </w:tc>
+      </w:tr>
+      <w:tr>
+        <w:tc>
+          <w:tcPr/>
+          <w:p>
+            <w:pPr>
+              <w:pStyle w:val="Compact"/>
+              <w:jc w:val="left"/>
+            </w:pPr>
+            <w:r>
+              <w:t xml:space="preserve">Prueba 2</w:t>
+            </w:r>
+          </w:p>
+        </w:tc>
+        <w:tc>
+          <w:tcPr/>
+          <w:p>
+            <w:pPr>
+              <w:pStyle w:val="Compact"/>
+              <w:jc w:val="right"/>
+            </w:pPr>
+            <w:r>
+              <w:t xml:space="preserve">613</w:t>
+            </w:r>
+          </w:p>
+        </w:tc>
+        <w:tc>
+          <w:tcPr/>
+          <w:p>
+            <w:pPr>
+              <w:pStyle w:val="Compact"/>
+              <w:jc w:val="right"/>
+            </w:pPr>
+            <w:r>
+              <w:t xml:space="preserve">609</w:t>
+            </w:r>
+          </w:p>
+        </w:tc>
+        <w:tc>
+          <w:tcPr/>
+          <w:p>
+            <w:pPr>
+              <w:pStyle w:val="Compact"/>
+              <w:jc w:val="right"/>
+            </w:pPr>
+            <w:r>
+              <w:t xml:space="preserve">747</w:t>
+            </w:r>
+          </w:p>
+        </w:tc>
+      </w:tr>
+      <w:tr>
+        <w:tc>
+          <w:tcPr/>
+          <w:p>
+            <w:pPr>
+              <w:pStyle w:val="Compact"/>
+              <w:jc w:val="left"/>
+            </w:pPr>
+            <w:r>
+              <w:t xml:space="preserve">Prueba 3</w:t>
+            </w:r>
+          </w:p>
+        </w:tc>
+        <w:tc>
+          <w:tcPr/>
+          <w:p>
+            <w:pPr>
+              <w:pStyle w:val="Compact"/>
+              <w:jc w:val="right"/>
+            </w:pPr>
+            <w:r>
+              <w:t xml:space="preserve">738</w:t>
+            </w:r>
+          </w:p>
+        </w:tc>
+        <w:tc>
+          <w:tcPr/>
+          <w:p>
+            <w:pPr>
+              <w:pStyle w:val="Compact"/>
+              <w:jc w:val="right"/>
+            </w:pPr>
+            <w:r>
+              <w:t xml:space="preserve">619</w:t>
+            </w:r>
+          </w:p>
+        </w:tc>
+        <w:tc>
+          <w:tcPr/>
+          <w:p>
+            <w:pPr>
+              <w:pStyle w:val="Compact"/>
+              <w:jc w:val="right"/>
+            </w:pPr>
+            <w:r>
+              <w:t xml:space="preserve">526</w:t>
+            </w:r>
+          </w:p>
+        </w:tc>
+      </w:tr>
+      <w:tr>
+        <w:tc>
+          <w:tcPr/>
+          <w:p>
+            <w:pPr>
+              <w:pStyle w:val="Compact"/>
+              <w:jc w:val="left"/>
+            </w:pPr>
+            <w:r>
+              <w:t xml:space="preserve">Prueba 4</w:t>
+            </w:r>
+          </w:p>
+        </w:tc>
+        <w:tc>
+          <w:tcPr/>
+          <w:p>
+            <w:pPr>
+              <w:pStyle w:val="Compact"/>
+              <w:jc w:val="right"/>
+            </w:pPr>
+            <w:r>
+              <w:t xml:space="preserve">606</w:t>
+            </w:r>
+          </w:p>
+        </w:tc>
+        <w:tc>
+          <w:tcPr/>
+          <w:p>
+            <w:pPr>
+              <w:pStyle w:val="Compact"/>
+              <w:jc w:val="right"/>
+            </w:pPr>
+            <w:r>
+              <w:t xml:space="preserve">724</w:t>
+            </w:r>
+          </w:p>
+        </w:tc>
+        <w:tc>
+          <w:tcPr/>
+          <w:p>
+            <w:pPr>
+              <w:pStyle w:val="Compact"/>
+              <w:jc w:val="right"/>
+            </w:pPr>
+            <w:r>
+              <w:t xml:space="preserve">611</w:t>
+            </w:r>
+          </w:p>
+        </w:tc>
+      </w:tr>
+      <w:tr>
+        <w:tc>
+          <w:tcPr/>
+          <w:p>
+            <w:pPr>
+              <w:pStyle w:val="Compact"/>
+              <w:jc w:val="left"/>
+            </w:pPr>
+            <w:r>
+              <w:t xml:space="preserve">Prueba 5</w:t>
+            </w:r>
+          </w:p>
+        </w:tc>
+        <w:tc>
+          <w:tcPr/>
+          <w:p>
+            <w:pPr>
+              <w:pStyle w:val="Compact"/>
+              <w:jc w:val="right"/>
+            </w:pPr>
+            <w:r>
+              <w:t xml:space="preserve">783</w:t>
+            </w:r>
+          </w:p>
+        </w:tc>
+        <w:tc>
+          <w:tcPr/>
+          <w:p>
+            <w:pPr>
+              <w:pStyle w:val="Compact"/>
+              <w:jc w:val="right"/>
+            </w:pPr>
+            <w:r>
+              <w:t xml:space="preserve">750</w:t>
+            </w:r>
+          </w:p>
+        </w:tc>
+        <w:tc>
+          <w:tcPr/>
+          <w:p>
+            <w:pPr>
+              <w:pStyle w:val="Compact"/>
+              <w:jc w:val="right"/>
+            </w:pPr>
+            <w:r>
+              <w:t xml:space="preserve">737</w:t>
+            </w:r>
+          </w:p>
+        </w:tc>
+      </w:tr>
+    </w:tbl>
+    <w:p>
+      <w:pPr>
+        <w:numPr>
+          <w:ilvl w:val="0"/>
+          <w:numId w:val="1000"/>
+        </w:numPr>
+      </w:pPr>
+      <w:r>
+        <w:t xml:space="preserve">Al comparar la mediana de las duraciones de la batería de los tres modelos, ¿cuál de las siguientes afirmaciones es correcta?</w:t>
+      </w:r>
+    </w:p>
+    <w:p>
+      <w:pPr>
+        <w:numPr>
+          <w:ilvl w:val="1"/>
+          <w:numId w:val="1022"/>
+        </w:numPr>
+      </w:pPr>
+      <w:r>
+        <w:t xml:space="preserve">El Modelo Q tiene una mediana igual a la del Modelo M y menor que la del Modelo V.</w:t>
+      </w:r>
+    </w:p>
+    <w:p>
+      <w:pPr>
+        <w:numPr>
+          <w:ilvl w:val="1"/>
+          <w:numId w:val="1022"/>
+        </w:numPr>
+      </w:pPr>
+      <w:r>
+        <w:t xml:space="preserve">El Modelo Q tiene una mediana igual a la del Modelo V y menor que la del Modelo M.</w:t>
+      </w:r>
+    </w:p>
+    <w:p>
+      <w:pPr>
+        <w:numPr>
+          <w:ilvl w:val="1"/>
+          <w:numId w:val="1022"/>
+        </w:numPr>
+      </w:pPr>
+      <w:r>
+        <w:t xml:space="preserve">El Modelo Q tiene una mediana mayor que la del Modelo V y que la del Modelo M.</w:t>
+      </w:r>
+    </w:p>
+    <w:p>
+      <w:pPr>
+        <w:numPr>
+          <w:ilvl w:val="1"/>
+          <w:numId w:val="1022"/>
+        </w:numPr>
+      </w:pPr>
+      <w:r>
+        <w:t xml:space="preserve">El Modelo Q tiene una mediana mayor que la del Modelo M y menor que la del Modelo V.</w:t>
+      </w:r>
+    </w:p>
+    <w:p>
+      <w:pPr>
+        <w:numPr>
+          <w:ilvl w:val="0"/>
+          <w:numId w:val="1000"/>
+        </w:numPr>
+      </w:pPr>
+      <w:r>
+        <w:rPr>
+          <w:b/>
+          <w:bCs/>
+        </w:rPr>
+        <w:t xml:space="preserve">Solución</w:t>
+      </w:r>
+      <w:r>
+        <w:br/>
+      </w:r>
+      <w:r>
+        <w:t xml:space="preserve">La respuesta correcta es: El Modelo Q tiene una mediana igual a la del Modelo M y menor que la del Modelo V.</w:t>
+      </w:r>
+    </w:p>
+    <w:p>
+      <w:pPr>
+        <w:numPr>
+          <w:ilvl w:val="0"/>
+          <w:numId w:val="1000"/>
+        </w:numPr>
+      </w:pPr>
+      <w:r>
+        <w:t xml:space="preserve">Para resolver este problema, debemos:</w:t>
+      </w:r>
+    </w:p>
+    <w:p>
+      <w:pPr>
+        <w:numPr>
+          <w:ilvl w:val="1"/>
+          <w:numId w:val="1023"/>
+        </w:numPr>
+      </w:pPr>
+      <w:r>
+        <w:t xml:space="preserve">Ordenar los datos de cada modelo y encontrar su mediana:</w:t>
+      </w:r>
+    </w:p>
+    <w:p>
+      <w:pPr>
+        <w:numPr>
+          <w:ilvl w:val="1"/>
+          <w:numId w:val="1024"/>
+        </w:numPr>
+      </w:pPr>
+      <w:r>
+        <w:t xml:space="preserve">Modelo M: 526, 611, 619, 737, 747 → Mediana = 619</w:t>
+      </w:r>
+    </w:p>
+    <w:p>
+      <w:pPr>
+        <w:numPr>
+          <w:ilvl w:val="1"/>
+          <w:numId w:val="1024"/>
+        </w:numPr>
+      </w:pPr>
+      <w:r>
+        <w:t xml:space="preserve">Modelo V: 606, 613, 622, 738, 783 → Mediana = 622</w:t>
+      </w:r>
+    </w:p>
+    <w:p>
+      <w:pPr>
+        <w:numPr>
+          <w:ilvl w:val="1"/>
+          <w:numId w:val="1024"/>
+        </w:numPr>
+      </w:pPr>
+      <w:r>
+        <w:t xml:space="preserve">Modelo Q: 512, 609, 619, 724, 750 → Mediana = 619</w:t>
+      </w:r>
+    </w:p>
+    <w:p>
+      <w:pPr>
+        <w:numPr>
+          <w:ilvl w:val="1"/>
+          <w:numId w:val="1025"/>
+        </w:numPr>
+      </w:pPr>
+      <w:r>
+        <w:t xml:space="preserve">Comparar las medianas:</w:t>
+      </w:r>
+    </w:p>
+    <w:p>
+      <w:pPr>
+        <w:numPr>
+          <w:ilvl w:val="1"/>
+          <w:numId w:val="1026"/>
+        </w:numPr>
+      </w:pPr>
+      <w:r>
+        <w:t xml:space="preserve">Mediana de Modelo Q (619) = Mediana de Modelo M (619)</w:t>
+      </w:r>
+    </w:p>
+    <w:p>
+      <w:pPr>
+        <w:numPr>
+          <w:ilvl w:val="1"/>
+          <w:numId w:val="1026"/>
+        </w:numPr>
+      </w:pPr>
+      <w:r>
+        <w:t xml:space="preserve">Mediana de Modelo Q (619) &lt; Mediana de Modelo V (622)</w:t>
+      </w:r>
+    </w:p>
+    <w:p>
+      <w:pPr>
+        <w:numPr>
+          <w:ilvl w:val="0"/>
+          <w:numId w:val="1000"/>
+        </w:numPr>
+      </w:pPr>
+      <w:r>
+        <w:t xml:space="preserve">Por lo tanto, el Modelo Q tiene una mediana igual a la del Modelo M y menor que la del Modelo V.</w:t>
       </w:r>
     </w:p>
     <w:bookmarkEnd w:id="20"/>
@@ -2263,6 +3283,198 @@
     </w:lvlOverride>
   </w:num>
   <w:num w:numId="1016">
+    <w:abstractNumId w:val="991"/>
+  </w:num>
+  <w:num w:numId="1017">
+    <w:abstractNumId w:val="99201"/>
+    <w:lvlOverride w:ilvl="0">
+      <w:startOverride w:val="1"/>
+    </w:lvlOverride>
+    <w:lvlOverride w:ilvl="1">
+      <w:startOverride w:val="1"/>
+    </w:lvlOverride>
+    <w:lvlOverride w:ilvl="2">
+      <w:startOverride w:val="1"/>
+    </w:lvlOverride>
+    <w:lvlOverride w:ilvl="3">
+      <w:startOverride w:val="1"/>
+    </w:lvlOverride>
+    <w:lvlOverride w:ilvl="4">
+      <w:startOverride w:val="1"/>
+    </w:lvlOverride>
+    <w:lvlOverride w:ilvl="5">
+      <w:startOverride w:val="1"/>
+    </w:lvlOverride>
+    <w:lvlOverride w:ilvl="6">
+      <w:startOverride w:val="1"/>
+    </w:lvlOverride>
+    <w:lvlOverride w:ilvl="7">
+      <w:startOverride w:val="1"/>
+    </w:lvlOverride>
+    <w:lvlOverride w:ilvl="8">
+      <w:startOverride w:val="1"/>
+    </w:lvlOverride>
+  </w:num>
+  <w:num w:numId="1018">
+    <w:abstractNumId w:val="99201"/>
+    <w:lvlOverride w:ilvl="0">
+      <w:startOverride w:val="1"/>
+    </w:lvlOverride>
+    <w:lvlOverride w:ilvl="1">
+      <w:startOverride w:val="1"/>
+    </w:lvlOverride>
+    <w:lvlOverride w:ilvl="2">
+      <w:startOverride w:val="1"/>
+    </w:lvlOverride>
+    <w:lvlOverride w:ilvl="3">
+      <w:startOverride w:val="1"/>
+    </w:lvlOverride>
+    <w:lvlOverride w:ilvl="4">
+      <w:startOverride w:val="1"/>
+    </w:lvlOverride>
+    <w:lvlOverride w:ilvl="5">
+      <w:startOverride w:val="1"/>
+    </w:lvlOverride>
+    <w:lvlOverride w:ilvl="6">
+      <w:startOverride w:val="1"/>
+    </w:lvlOverride>
+    <w:lvlOverride w:ilvl="7">
+      <w:startOverride w:val="1"/>
+    </w:lvlOverride>
+    <w:lvlOverride w:ilvl="8">
+      <w:startOverride w:val="1"/>
+    </w:lvlOverride>
+  </w:num>
+  <w:num w:numId="1019">
+    <w:abstractNumId w:val="991"/>
+  </w:num>
+  <w:num w:numId="1020">
+    <w:abstractNumId w:val="99201"/>
+    <w:lvlOverride w:ilvl="0">
+      <w:startOverride w:val="1"/>
+    </w:lvlOverride>
+    <w:lvlOverride w:ilvl="1">
+      <w:startOverride w:val="1"/>
+    </w:lvlOverride>
+    <w:lvlOverride w:ilvl="2">
+      <w:startOverride w:val="1"/>
+    </w:lvlOverride>
+    <w:lvlOverride w:ilvl="3">
+      <w:startOverride w:val="1"/>
+    </w:lvlOverride>
+    <w:lvlOverride w:ilvl="4">
+      <w:startOverride w:val="1"/>
+    </w:lvlOverride>
+    <w:lvlOverride w:ilvl="5">
+      <w:startOverride w:val="1"/>
+    </w:lvlOverride>
+    <w:lvlOverride w:ilvl="6">
+      <w:startOverride w:val="1"/>
+    </w:lvlOverride>
+    <w:lvlOverride w:ilvl="7">
+      <w:startOverride w:val="1"/>
+    </w:lvlOverride>
+    <w:lvlOverride w:ilvl="8">
+      <w:startOverride w:val="1"/>
+    </w:lvlOverride>
+  </w:num>
+  <w:num w:numId="1021">
+    <w:abstractNumId w:val="991"/>
+  </w:num>
+  <w:num w:numId="1022">
+    <w:abstractNumId w:val="99201"/>
+    <w:lvlOverride w:ilvl="0">
+      <w:startOverride w:val="1"/>
+    </w:lvlOverride>
+    <w:lvlOverride w:ilvl="1">
+      <w:startOverride w:val="1"/>
+    </w:lvlOverride>
+    <w:lvlOverride w:ilvl="2">
+      <w:startOverride w:val="1"/>
+    </w:lvlOverride>
+    <w:lvlOverride w:ilvl="3">
+      <w:startOverride w:val="1"/>
+    </w:lvlOverride>
+    <w:lvlOverride w:ilvl="4">
+      <w:startOverride w:val="1"/>
+    </w:lvlOverride>
+    <w:lvlOverride w:ilvl="5">
+      <w:startOverride w:val="1"/>
+    </w:lvlOverride>
+    <w:lvlOverride w:ilvl="6">
+      <w:startOverride w:val="1"/>
+    </w:lvlOverride>
+    <w:lvlOverride w:ilvl="7">
+      <w:startOverride w:val="1"/>
+    </w:lvlOverride>
+    <w:lvlOverride w:ilvl="8">
+      <w:startOverride w:val="1"/>
+    </w:lvlOverride>
+  </w:num>
+  <w:num w:numId="1023">
+    <w:abstractNumId w:val="99201"/>
+    <w:lvlOverride w:ilvl="0">
+      <w:startOverride w:val="1"/>
+    </w:lvlOverride>
+    <w:lvlOverride w:ilvl="1">
+      <w:startOverride w:val="1"/>
+    </w:lvlOverride>
+    <w:lvlOverride w:ilvl="2">
+      <w:startOverride w:val="1"/>
+    </w:lvlOverride>
+    <w:lvlOverride w:ilvl="3">
+      <w:startOverride w:val="1"/>
+    </w:lvlOverride>
+    <w:lvlOverride w:ilvl="4">
+      <w:startOverride w:val="1"/>
+    </w:lvlOverride>
+    <w:lvlOverride w:ilvl="5">
+      <w:startOverride w:val="1"/>
+    </w:lvlOverride>
+    <w:lvlOverride w:ilvl="6">
+      <w:startOverride w:val="1"/>
+    </w:lvlOverride>
+    <w:lvlOverride w:ilvl="7">
+      <w:startOverride w:val="1"/>
+    </w:lvlOverride>
+    <w:lvlOverride w:ilvl="8">
+      <w:startOverride w:val="1"/>
+    </w:lvlOverride>
+  </w:num>
+  <w:num w:numId="1024">
+    <w:abstractNumId w:val="991"/>
+  </w:num>
+  <w:num w:numId="1025">
+    <w:abstractNumId w:val="99201"/>
+    <w:lvlOverride w:ilvl="0">
+      <w:startOverride w:val="1"/>
+    </w:lvlOverride>
+    <w:lvlOverride w:ilvl="1">
+      <w:startOverride w:val="1"/>
+    </w:lvlOverride>
+    <w:lvlOverride w:ilvl="2">
+      <w:startOverride w:val="1"/>
+    </w:lvlOverride>
+    <w:lvlOverride w:ilvl="3">
+      <w:startOverride w:val="1"/>
+    </w:lvlOverride>
+    <w:lvlOverride w:ilvl="4">
+      <w:startOverride w:val="1"/>
+    </w:lvlOverride>
+    <w:lvlOverride w:ilvl="5">
+      <w:startOverride w:val="1"/>
+    </w:lvlOverride>
+    <w:lvlOverride w:ilvl="6">
+      <w:startOverride w:val="1"/>
+    </w:lvlOverride>
+    <w:lvlOverride w:ilvl="7">
+      <w:startOverride w:val="1"/>
+    </w:lvlOverride>
+    <w:lvlOverride w:ilvl="8">
+      <w:startOverride w:val="1"/>
+    </w:lvlOverride>
+  </w:num>
+  <w:num w:numId="1026">
     <w:abstractNumId w:val="991"/>
   </w:num>
 </w:numbering>

</xml_diff>